<commit_message>
7.2119+ features, one crash fix, and a few minor changes. +V7.21192 a screen size issue and a debug message
</commit_message>
<xml_diff>
--- a/Revisions.docx
+++ b/Revisions.docx
@@ -7,7 +7,16 @@
         <w:pStyle w:val="Heading1"/>
       </w:pPr>
       <w:r>
-        <w:t xml:space="preserve">V7.2119+ features, one crash fix, and a few minor changes.  </w:t>
+        <w:t>V7.2119</w:t>
+      </w:r>
+      <w:r>
+        <w:t>2</w:t>
+      </w:r>
+      <w:r>
+        <w:t xml:space="preserve"> </w:t>
+      </w:r>
+      <w:r>
+        <w:t>a screen size issue and a debug message</w:t>
       </w:r>
     </w:p>
     <w:p>
@@ -47,10 +56,58 @@
       </w:r>
     </w:p>
     <w:p>
+      <w:r>
+        <w:t>Maria</w:t>
+      </w:r>
+      <w:r>
+        <w:t>D</w:t>
+      </w:r>
+      <w:r>
+        <w:t xml:space="preserve">b upgrade did not work for one person.    I added some debug code </w:t>
+      </w:r>
+      <w:r>
+        <w:t>in this to log the error</w:t>
+      </w:r>
+      <w:r>
+        <w:t>.</w:t>
+      </w:r>
+    </w:p>
+    <w:p>
+      <w:pPr>
+        <w:rPr>
+          <w:b/>
+          <w:bCs/>
+        </w:rPr>
+      </w:pPr>
+      <w:r>
+        <w:rPr>
+          <w:b/>
+          <w:bCs/>
+        </w:rPr>
+        <w:t xml:space="preserve">3D preview windows in wrong spot:   </w:t>
+      </w:r>
+    </w:p>
+    <w:p>
+      <w:r>
+        <w:t>The two 3D previewers are created in code with fixed pixel positions (258,107, 200×200). By the time they're added, WinForms has already scaled the rest of the form for the screen zoom, and controls added after that don't get scaled. So at 125% or 150% the picture and group box moved and grew, but the previewers stayed at their 100% spot.</w:t>
+      </w:r>
+    </w:p>
+    <w:p>
+      <w:r>
+        <w:t>Fix: The previewers now take their position and size from PictureBox1, which is scaled. They sit just to its right, the same as at 100%.</w:t>
+      </w:r>
+    </w:p>
+    <w:p>
       <w:pPr>
         <w:pStyle w:val="Heading2"/>
       </w:pPr>
       <w:r>
+        <w:t>V7.21191</w:t>
+      </w:r>
+      <w:r>
+        <w:t xml:space="preserve"> </w:t>
+      </w:r>
+      <w:r>
         <w:t>FSASSETS WAS BUSTICATED</w:t>
       </w:r>
     </w:p>
@@ -105,10 +162,7 @@
     </w:p>
     <w:p>
       <w:r>
-        <w:t>Why it happened</w:t>
-      </w:r>
-      <w:r>
-        <w:t>:</w:t>
+        <w:t>Why it happened:</w:t>
       </w:r>
     </w:p>
     <w:p>
@@ -116,31 +170,7 @@
         <w:ind w:left="720"/>
       </w:pPr>
       <w:r>
-        <w:t xml:space="preserve">1. Store wrote the </w:t>
-      </w:r>
-      <w:proofErr w:type="spellStart"/>
-      <w:r>
-        <w:t>fsassets</w:t>
-      </w:r>
-      <w:proofErr w:type="spellEnd"/>
-      <w:r>
-        <w:t xml:space="preserve"> row right away, while the asset data only sat in the spool folder (</w:t>
-      </w:r>
-      <w:proofErr w:type="spellStart"/>
-      <w:r>
-        <w:t>fsassets</w:t>
-      </w:r>
-      <w:proofErr w:type="spellEnd"/>
-      <w:r>
-        <w:t>\</w:t>
-      </w:r>
-      <w:proofErr w:type="spellStart"/>
-      <w:r>
-        <w:t>tmp</w:t>
-      </w:r>
-      <w:proofErr w:type="spellEnd"/>
-      <w:r>
-        <w:t>).</w:t>
+        <w:t>1. Store wrote the fsassets row right away, while the asset data only sat in the spool folder (fsassets\tmp).</w:t>
       </w:r>
     </w:p>
     <w:p>
@@ -148,23 +178,7 @@
         <w:ind w:left="720"/>
       </w:pPr>
       <w:r>
-        <w:t xml:space="preserve">2. A background thread </w:t>
-      </w:r>
-      <w:proofErr w:type="spellStart"/>
-      <w:r>
-        <w:t>gzipped</w:t>
-      </w:r>
-      <w:proofErr w:type="spellEnd"/>
-      <w:r>
-        <w:t xml:space="preserve"> it into data\ later. It wrote straight onto the final name and never forced it to disk. A crash or power cut could leave an empty or broken .</w:t>
-      </w:r>
-      <w:proofErr w:type="spellStart"/>
-      <w:r>
-        <w:t>gz</w:t>
-      </w:r>
-      <w:proofErr w:type="spellEnd"/>
-      <w:r>
-        <w:t>, and OpenSim then treated it as present forever.</w:t>
+        <w:t>2. A background thread gzipped it into data\ later. It wrote straight onto the final name and never forced it to disk. A crash or power cut could leave an empty or broken .gz, and OpenSim then treated it as present forever.</w:t>
       </w:r>
       <w:r>
         <w:t xml:space="preserve"> It didn’t bother to flush to disk which is bad.</w:t>
@@ -175,13 +189,7 @@
         <w:ind w:left="720"/>
       </w:pPr>
       <w:r>
-        <w:t xml:space="preserve">3. That thread's error check only works under Mono. On .NET, any locked file (antivirus, </w:t>
-      </w:r>
-      <w:r>
-        <w:t>a</w:t>
-      </w:r>
-      <w:r>
-        <w:t xml:space="preserve"> robocopy backup) crashed Robust.</w:t>
+        <w:t>3. That thread's error check only works under Mono. On .NET, any locked file (antivirus, a robocopy backup) crashed Robust.</w:t>
       </w:r>
     </w:p>
     <w:p>
@@ -189,23 +197,7 @@
         <w:ind w:left="720"/>
       </w:pPr>
       <w:r>
-        <w:t>4. Two saves of the same content could race. Proof: 4 orphaned temp files in bin\</w:t>
-      </w:r>
-      <w:proofErr w:type="spellStart"/>
-      <w:r>
-        <w:t>fsassets</w:t>
-      </w:r>
-      <w:proofErr w:type="spellEnd"/>
-      <w:r>
-        <w:t>\</w:t>
-      </w:r>
-      <w:proofErr w:type="spellStart"/>
-      <w:r>
-        <w:t>tmp</w:t>
-      </w:r>
-      <w:proofErr w:type="spellEnd"/>
-      <w:r>
-        <w:t>\spool, from 2025-04-23.</w:t>
+        <w:t>4. Two saves of the same content could race. Proof: 4 orphaned temp files in bin\fsassets\tmp\spool, from 2025-04-23.</w:t>
       </w:r>
     </w:p>
     <w:p>
@@ -213,23 +205,7 @@
         <w:jc w:val="both"/>
       </w:pPr>
       <w:r>
-        <w:t xml:space="preserve">And it’s fixed. 40 different unit tests </w:t>
-      </w:r>
-      <w:proofErr w:type="gramStart"/>
-      <w:r>
-        <w:t>pass</w:t>
-      </w:r>
-      <w:proofErr w:type="gramEnd"/>
-      <w:r>
-        <w:t xml:space="preserve">. And </w:t>
-      </w:r>
-      <w:proofErr w:type="gramStart"/>
-      <w:r>
-        <w:t>If</w:t>
-      </w:r>
-      <w:proofErr w:type="gramEnd"/>
-      <w:r>
-        <w:t xml:space="preserve"> you load an OAR and halfway through you crash it, nothing is corrupted.</w:t>
+        <w:t>And it’s fixed. 40 different unit tests pass. And If you load an OAR and halfway through you crash it, nothing is corrupted.</w:t>
       </w:r>
     </w:p>
     <w:p>
@@ -237,15 +213,7 @@
         <w:ind w:left="720"/>
       </w:pPr>
       <w:r>
-        <w:t xml:space="preserve">1. Each save now writes </w:t>
-      </w:r>
-      <w:proofErr w:type="spellStart"/>
-      <w:r>
-        <w:t>hash.gz.tmp</w:t>
-      </w:r>
-      <w:proofErr w:type="spellEnd"/>
-      <w:r>
-        <w:t>, forces it to disk, renames it to hash.gz, and only then writes the database row.</w:t>
+        <w:t>1. Each save now writes hash.gz.tmp, forces it to disk, renames it to hash.gz, and only then writes the database row.</w:t>
       </w:r>
     </w:p>
     <w:p>
@@ -253,6 +221,7 @@
         <w:ind w:left="720"/>
       </w:pPr>
       <w:r>
+        <w:lastRenderedPageBreak/>
         <w:t>2. A lock per hash stops the same-content race.</w:t>
       </w:r>
     </w:p>
@@ -261,23 +230,7 @@
         <w:ind w:left="720"/>
       </w:pPr>
       <w:r>
-        <w:t>3. An empty or non-</w:t>
-      </w:r>
-      <w:proofErr w:type="spellStart"/>
-      <w:r>
-        <w:t>gzip</w:t>
-      </w:r>
-      <w:proofErr w:type="spellEnd"/>
-      <w:r>
-        <w:t xml:space="preserve"> .</w:t>
-      </w:r>
-      <w:proofErr w:type="spellStart"/>
-      <w:r>
-        <w:t>gz</w:t>
-      </w:r>
-      <w:proofErr w:type="spellEnd"/>
-      <w:r>
-        <w:t xml:space="preserve"> no longer counts as present, so the next save rewrites it.</w:t>
+        <w:t>3. An empty or non-gzip .gz no longer counts as present, so the next save rewrites it.</w:t>
       </w:r>
     </w:p>
     <w:p>
@@ -285,26 +238,13 @@
         <w:ind w:left="720"/>
       </w:pPr>
       <w:r>
-        <w:t xml:space="preserve">4. The background thread now only clears files left in the spool folder by older versions. It </w:t>
-      </w:r>
-      <w:proofErr w:type="gramStart"/>
-      <w:r>
-        <w:t>logs</w:t>
-      </w:r>
-      <w:proofErr w:type="gramEnd"/>
-      <w:r>
-        <w:t xml:space="preserve"> errors </w:t>
-      </w:r>
-      <w:proofErr w:type="gramStart"/>
+        <w:t xml:space="preserve">4. The background thread now only clears files left in the spool folder by older versions. It logs errors </w:t>
+      </w:r>
       <w:r>
         <w:t xml:space="preserve">now, </w:t>
       </w:r>
       <w:r>
-        <w:t>and</w:t>
-      </w:r>
-      <w:proofErr w:type="gramEnd"/>
-      <w:r>
-        <w:t xml:space="preserve"> never crashes Robust.</w:t>
+        <w:t>and never crashes Robust.</w:t>
       </w:r>
     </w:p>
     <w:p>
@@ -360,15 +300,7 @@
         <w:t xml:space="preserve">gives </w:t>
       </w:r>
       <w:r>
-        <w:t xml:space="preserve"> </w:t>
-      </w:r>
-      <w:proofErr w:type="spellStart"/>
-      <w:r>
-        <w:t>ubODE</w:t>
-      </w:r>
-      <w:proofErr w:type="spellEnd"/>
-      <w:r>
-        <w:t xml:space="preserve"> doors!  </w:t>
+        <w:t xml:space="preserve"> ubODE doors!  </w:t>
       </w:r>
     </w:p>
     <w:p>
@@ -424,6 +356,9 @@
         <w:t xml:space="preserve">  </w:t>
       </w:r>
       <w:r>
+        <w:rPr>
+          <w:noProof/>
+        </w:rPr>
         <w:drawing>
           <wp:inline distT="0" distB="0" distL="0" distR="0" wp14:anchorId="6D5CC346" wp14:editId="1CCF904E">
             <wp:extent cx="2977791" cy="1736168"/>
@@ -479,6 +414,7 @@
         <w:rPr>
           <w:noProof/>
         </w:rPr>
+        <w:lastRenderedPageBreak/>
         <w:drawing>
           <wp:inline distT="0" distB="0" distL="0" distR="0" wp14:anchorId="239EC852" wp14:editId="5CBDF92C">
             <wp:extent cx="5943600" cy="3041650"/>
@@ -645,6 +581,7 @@
         <w:pStyle w:val="Heading2"/>
       </w:pPr>
       <w:r>
+        <w:lastRenderedPageBreak/>
         <w:t>Filters:</w:t>
       </w:r>
     </w:p>
@@ -716,15 +653,7 @@
         <w:t>▼</w:t>
       </w:r>
       <w:r>
-        <w:t xml:space="preserve"> (or </w:t>
-      </w:r>
-      <w:proofErr w:type="gramStart"/>
-      <w:r>
-        <w:t>right-clicking</w:t>
-      </w:r>
-      <w:proofErr w:type="gramEnd"/>
-      <w:r>
-        <w:t xml:space="preserve"> the heading) opens the filter menu:</w:t>
+        <w:t xml:space="preserve"> (or right-clicking the heading) opens the filter menu:</w:t>
       </w:r>
     </w:p>
     <w:p>
@@ -847,13 +776,8 @@
       </w:r>
     </w:p>
     <w:p>
-      <w:proofErr w:type="gramStart"/>
-      <w:r>
-        <w:t>Allows</w:t>
-      </w:r>
-      <w:proofErr w:type="gramEnd"/>
-      <w:r>
-        <w:t xml:space="preserve"> you to use larger caches that will never fill up the disk. Both % free and Absolute size limits instead of time.</w:t>
+      <w:r>
+        <w:t>Allows you to use larger caches that will never fill up the disk. Both % free and Absolute size limits instead of time.</w:t>
       </w:r>
     </w:p>
     <w:p>
@@ -866,34 +790,19 @@
         <w:pStyle w:val="Heading2"/>
       </w:pPr>
       <w:r>
+        <w:lastRenderedPageBreak/>
         <w:t>OAR loading</w:t>
       </w:r>
     </w:p>
     <w:p>
       <w:r>
-        <w:t xml:space="preserve">Loading an OAR can take up to 5 minutes or longer after </w:t>
-      </w:r>
-      <w:proofErr w:type="gramStart"/>
-      <w:r>
-        <w:t>loading</w:t>
-      </w:r>
-      <w:proofErr w:type="gramEnd"/>
-      <w:r>
-        <w:t xml:space="preserve"> to RAM</w:t>
+        <w:t>Loading an OAR can take up to 5 minutes or longer after loading to RAM</w:t>
       </w:r>
       <w:r>
         <w:t xml:space="preserve"> </w:t>
       </w:r>
       <w:r>
-        <w:t xml:space="preserve">to </w:t>
-      </w:r>
-      <w:proofErr w:type="gramStart"/>
-      <w:r>
-        <w:t>save to disk</w:t>
-      </w:r>
-      <w:proofErr w:type="gramEnd"/>
-      <w:r>
-        <w:t>.  It</w:t>
+        <w:t>to save to disk.  It</w:t>
       </w:r>
       <w:r>
         <w:t>’</w:t>
@@ -1014,6 +923,7 @@
     </w:p>
     <w:p>
       <w:r>
+        <w:lastRenderedPageBreak/>
         <w:t xml:space="preserve"> -  Name. For a link, the name is followed by an arrow and the name of what it points to.</w:t>
       </w:r>
     </w:p>
@@ -1034,15 +944,7 @@
     </w:p>
     <w:p>
       <w:r>
-        <w:t xml:space="preserve"> -  Creator: who made it. A creator from another grid is shown with </w:t>
-      </w:r>
-      <w:proofErr w:type="gramStart"/>
-      <w:r>
-        <w:t>an</w:t>
-      </w:r>
-      <w:proofErr w:type="gramEnd"/>
-      <w:r>
-        <w:t xml:space="preserve"> @ and the name of their grid.</w:t>
+        <w:t xml:space="preserve"> -  Creator: who made it. A creator from another grid is shown with an @ and the name of their grid.</w:t>
       </w:r>
     </w:p>
     <w:p>

</xml_diff>